<commit_message>
Add a human-friendly README (Arabic) as the repository front page
Explains what the system does, how a report moves through it, who uses it,
how it works inside, the technologies and why they were chosen, security,
requirements, step-by-step setup and settings. Replaces README.txt.

Co-Authored-By: Claude Opus 5 <noreply@anthropic.com>
</commit_message>
<xml_diff>
--- a/Doc/Word/11-Source-Code-GitHub.docx
+++ b/Doc/Word/11-Source-Code-GitHub.docx
@@ -860,7 +860,7 @@
                 <w:sz w:val="17"/>
                 <w:szCs w:val="17"/>
               </w:rPr>
-              <w:t xml:space="preserve">README.txt</w:t>
+              <w:t xml:space="preserve">README.md</w:t>
             </w:r>
             <w:r>
               <w:rPr>
@@ -933,6 +933,22 @@
             <w:pPr>
               <w:spacing w:after="0" w:before="0" w:line="252"/>
             </w:pPr>
+            <w:r>
+              <w:rPr>
+                <w:rFonts w:ascii="Consolas" w:cs="Consolas" w:eastAsia="Consolas" w:hAnsi="Consolas"/>
+                <w:color w:val="8A3B12"/>
+                <w:sz w:val="17"/>
+                <w:szCs w:val="17"/>
+              </w:rPr>
+              <w:t xml:space="preserve">README.md</w:t>
+            </w:r>
+            <w:r>
+              <w:rPr>
+                <w:sz w:val="19"/>
+                <w:szCs w:val="19"/>
+              </w:rPr>
+              <w:t xml:space="preserve"> is the repository front page</w:t>
+            </w:r>
           </w:p>
         </w:tc>
       </w:tr>

</xml_diff>